<commit_message>
Retira "Productividad del equipo" del Dashboard
- Elimina la sección de productividad (conexiones, ejecutivas activas,
  duración, ranking, sesiones del día y Excel mensual) de "Vista general"
  y "Mi trabajo", junto con sus cálculos, workers y componentes sin uso.
- Deja de registrar inicios y cierres de sesión: se retiran
  GET /dashboard/sessions, POST /auth/logout, session_history_id del login,
  auth/session_history_db.py y los servicios/esquemas asociados.
- "Cerrar sesión" vuelve al acceso sin llamar al servidor.
- Se conservan el modelo, la migración y los datos históricos de
  user_session_history (sin cambios destructivos).
- Actualiza pruebas, checklist E2E, acta y manual de usuario regenerado.

Co-Authored-By: Claude Opus 5.5 <noreply@anthropic.com>
</commit_message>
<xml_diff>
--- a/outputs/Manual_Usuario_Controlia_Cobranzas.docx
+++ b/outputs/Manual_Usuario_Controlia_Cobranzas.docx
@@ -1374,7 +1374,7 @@
     </w:p>
     <w:p>
       <w:r>
-        <w:t>Controlia Cobranzas centraliza el trabajo operativo de cobranza en una sola aplicación de escritorio. Permite controlar carteras por compañía, consultar deudores, registrar gestiones y pagos, preparar comunicaciones, comparar nóminas mensuales y observar indicadores de productividad.</w:t>
+        <w:t>Controlia Cobranzas centraliza el trabajo operativo de cobranza en una sola aplicación de escritorio. Permite controlar carteras por compañía, consultar deudores, registrar gestiones y pagos, preparar comunicaciones, comparar nóminas mensuales y observar indicadores operativos.</w:t>
       </w:r>
     </w:p>
     <w:p>
@@ -1394,7 +1394,7 @@
         <w:ind w:left="403" w:hanging="230"/>
       </w:pPr>
       <w:r>
-        <w:t>Mantiene trazabilidad de gestiones, pagos, asignaciones y sesiones.</w:t>
+        <w:t>Mantiene trazabilidad de gestiones, pagos y asignaciones.</w:t>
       </w:r>
     </w:p>
     <w:p>
@@ -2714,7 +2714,7 @@
     </w:p>
     <w:p>
       <w:r>
-        <w:t>Para terminar, pulse Cerrar sesión en la barra superior. Esto registra el término de la sesión y vuelve a la pantalla de acceso. Evite dejar la aplicación abierta en un equipo compartido.</w:t>
+        <w:t>Para terminar, pulse Cerrar sesión en la barra superior. La aplicación vuelve a la pantalla de acceso. Evite dejar la aplicación abierta en un equipo compartido.</w:t>
       </w:r>
     </w:p>
     <w:p>
@@ -4933,7 +4933,7 @@
     </w:p>
     <w:p>
       <w:r>
-        <w:t>Coordina la operación. Puede conciliar nóminas, cargar bases y gestiones, asignar o reemplazar responsables de cartera, utilizar el envío masivo y consultar productividad. No puede administrar usuarios.</w:t>
+        <w:t>Coordina la operación. Puede conciliar nóminas, cargar bases y gestiones, asignar o reemplazar responsables de cartera, utilizar el envío masivo y consultar el Dashboard. No puede administrar usuarios.</w:t>
       </w:r>
     </w:p>
     <w:p>
@@ -5193,7 +5193,7 @@
           <w:color w:val="64748B"/>
           <w:sz w:val="20"/>
         </w:rPr>
-        <w:t>Lectura de la cartera, prioridades y productividad</w:t>
+        <w:t>Lectura de la cartera, prioridades y comisiones</w:t>
       </w:r>
     </w:p>
     <w:p>
@@ -7061,173 +7061,6 @@
           </w:p>
         </w:tc>
       </w:tr>
-      <w:tr>
-        <w:trPr>
-          <w:cantSplit/>
-        </w:trPr>
-        <w:tc>
-          <w:tcPr>
-            <w:tcW w:type="dxa" w:w="2250"/>
-            <w:tcMar>
-              <w:top w:w="90" w:type="dxa"/>
-              <w:start w:w="120" w:type="dxa"/>
-              <w:bottom w:w="90" w:type="dxa"/>
-              <w:end w:w="120" w:type="dxa"/>
-            </w:tcMar>
-            <w:vAlign w:val="center"/>
-          </w:tcPr>
-          <w:p>
-            <w:pPr>
-              <w:spacing w:after="0"/>
-            </w:pPr>
-            <w:r>
-              <w:rPr>
-                <w:rFonts w:ascii="Segoe UI" w:hAnsi="Segoe UI"/>
-                <w:color w:val="0F172A"/>
-                <w:sz w:val="17"/>
-              </w:rPr>
-              <w:t>Conexiones hoy / del mes</w:t>
-            </w:r>
-          </w:p>
-        </w:tc>
-        <w:tc>
-          <w:tcPr>
-            <w:tcW w:type="dxa" w:w="7110"/>
-            <w:tcMar>
-              <w:top w:w="90" w:type="dxa"/>
-              <w:start w:w="120" w:type="dxa"/>
-              <w:bottom w:w="90" w:type="dxa"/>
-              <w:end w:w="120" w:type="dxa"/>
-            </w:tcMar>
-            <w:vAlign w:val="center"/>
-          </w:tcPr>
-          <w:p>
-            <w:pPr>
-              <w:spacing w:after="0"/>
-            </w:pPr>
-            <w:r>
-              <w:rPr>
-                <w:rFonts w:ascii="Segoe UI" w:hAnsi="Segoe UI"/>
-                <w:color w:val="0F172A"/>
-                <w:sz w:val="17"/>
-              </w:rPr>
-              <w:t>Actividad de acceso al sistema.</w:t>
-            </w:r>
-          </w:p>
-        </w:tc>
-      </w:tr>
-      <w:tr>
-        <w:trPr>
-          <w:cantSplit/>
-        </w:trPr>
-        <w:tc>
-          <w:tcPr>
-            <w:tcW w:type="dxa" w:w="2250"/>
-            <w:shd w:fill="F8FAFC"/>
-            <w:tcMar>
-              <w:top w:w="90" w:type="dxa"/>
-              <w:start w:w="120" w:type="dxa"/>
-              <w:bottom w:w="90" w:type="dxa"/>
-              <w:end w:w="120" w:type="dxa"/>
-            </w:tcMar>
-            <w:vAlign w:val="center"/>
-          </w:tcPr>
-          <w:p>
-            <w:pPr>
-              <w:spacing w:after="0"/>
-            </w:pPr>
-            <w:r>
-              <w:rPr>
-                <w:rFonts w:ascii="Segoe UI" w:hAnsi="Segoe UI"/>
-                <w:color w:val="0F172A"/>
-                <w:sz w:val="17"/>
-              </w:rPr>
-              <w:t>Ejecutivas activas</w:t>
-            </w:r>
-          </w:p>
-        </w:tc>
-        <w:tc>
-          <w:tcPr>
-            <w:tcW w:type="dxa" w:w="7110"/>
-            <w:shd w:fill="F8FAFC"/>
-            <w:tcMar>
-              <w:top w:w="90" w:type="dxa"/>
-              <w:start w:w="120" w:type="dxa"/>
-              <w:bottom w:w="90" w:type="dxa"/>
-              <w:end w:w="120" w:type="dxa"/>
-            </w:tcMar>
-            <w:vAlign w:val="center"/>
-          </w:tcPr>
-          <w:p>
-            <w:pPr>
-              <w:spacing w:after="0"/>
-            </w:pPr>
-            <w:r>
-              <w:rPr>
-                <w:rFonts w:ascii="Segoe UI" w:hAnsi="Segoe UI"/>
-                <w:color w:val="0F172A"/>
-                <w:sz w:val="17"/>
-              </w:rPr>
-              <w:t>Usuarios ejecutivos únicos con actividad.</w:t>
-            </w:r>
-          </w:p>
-        </w:tc>
-      </w:tr>
-      <w:tr>
-        <w:trPr>
-          <w:cantSplit/>
-        </w:trPr>
-        <w:tc>
-          <w:tcPr>
-            <w:tcW w:type="dxa" w:w="2250"/>
-            <w:tcMar>
-              <w:top w:w="90" w:type="dxa"/>
-              <w:start w:w="120" w:type="dxa"/>
-              <w:bottom w:w="90" w:type="dxa"/>
-              <w:end w:w="120" w:type="dxa"/>
-            </w:tcMar>
-            <w:vAlign w:val="center"/>
-          </w:tcPr>
-          <w:p>
-            <w:pPr>
-              <w:spacing w:after="0"/>
-            </w:pPr>
-            <w:r>
-              <w:rPr>
-                <w:rFonts w:ascii="Segoe UI" w:hAnsi="Segoe UI"/>
-                <w:color w:val="0F172A"/>
-                <w:sz w:val="17"/>
-              </w:rPr>
-              <w:t>Duración promedio</w:t>
-            </w:r>
-          </w:p>
-        </w:tc>
-        <w:tc>
-          <w:tcPr>
-            <w:tcW w:type="dxa" w:w="7110"/>
-            <w:tcMar>
-              <w:top w:w="90" w:type="dxa"/>
-              <w:start w:w="120" w:type="dxa"/>
-              <w:bottom w:w="90" w:type="dxa"/>
-              <w:end w:w="120" w:type="dxa"/>
-            </w:tcMar>
-            <w:vAlign w:val="center"/>
-          </w:tcPr>
-          <w:p>
-            <w:pPr>
-              <w:spacing w:after="0"/>
-            </w:pPr>
-            <w:r>
-              <w:rPr>
-                <w:rFonts w:ascii="Segoe UI" w:hAnsi="Segoe UI"/>
-                <w:color w:val="0F172A"/>
-                <w:sz w:val="17"/>
-              </w:rPr>
-              <w:t>Tiempo medio de sesiones cerradas calculables.</w:t>
-            </w:r>
-          </w:p>
-        </w:tc>
-      </w:tr>
     </w:tbl>
     <w:p>
       <w:pPr>
@@ -7236,7 +7069,7 @@
     </w:p>
     <w:p>
       <w:r>
-        <w:t>Seleccione el período disponible y pulse Actualizar para recalcular los indicadores. El Supervisor puede usar Descargar Excel mensual para obtener el reporte de conexiones de ejecutivas.</w:t>
+        <w:t>Seleccione el período disponible y pulse Actualizar para recalcular los indicadores.</w:t>
       </w:r>
     </w:p>
     <w:tbl>
@@ -14896,7 +14729,7 @@
         <w:ind w:left="403" w:hanging="230"/>
       </w:pPr>
       <w:r>
-        <w:t>Revisar Vista general, conexiones, cobertura y gestiones del día.</w:t>
+        <w:t>Revisar Vista general, cobertura y gestiones del día.</w:t>
       </w:r>
     </w:p>
     <w:p>

</xml_diff>